<commit_message>
Sync V7 rerun benchmark docs and artifact status
</commit_message>
<xml_diff>
--- a/docs/BENCHMARK_SUMMARY.docx
+++ b/docs/BENCHMARK_SUMMARY.docx
@@ -1140,6 +1140,104 @@
             </w:pPr>
             <w:r>
               <w:t xml:space="preserve">Documented stabilized V7 result from docs/notebook output.</w:t>
+            </w:r>
+          </w:p>
+        </w:tc>
+      </w:tr>
+      <w:tr>
+        <w:tc>
+          <w:tcPr/>
+          <w:p>
+            <w:pPr>
+              <w:pStyle w:val="Compact"/>
+            </w:pPr>
+            <w:r>
+              <w:t xml:space="preserve">V7_trainable_quantum_rerun</w:t>
+            </w:r>
+          </w:p>
+        </w:tc>
+        <w:tc>
+          <w:tcPr/>
+          <w:p>
+            <w:pPr>
+              <w:pStyle w:val="Compact"/>
+            </w:pPr>
+            <w:r>
+              <w:t xml:space="preserve">colab-l4-user-log</w:t>
+            </w:r>
+          </w:p>
+        </w:tc>
+        <w:tc>
+          <w:tcPr/>
+          <w:p>
+            <w:pPr>
+              <w:pStyle w:val="Compact"/>
+              <w:jc w:val="right"/>
+            </w:pPr>
+            <w:r>
+              <w:t xml:space="preserve">1</w:t>
+            </w:r>
+          </w:p>
+        </w:tc>
+        <w:tc>
+          <w:tcPr/>
+          <w:p>
+            <w:pPr>
+              <w:pStyle w:val="Compact"/>
+              <w:jc w:val="right"/>
+            </w:pPr>
+            <w:r>
+              <w:t xml:space="preserve">72.89 ± 0.00</w:t>
+            </w:r>
+          </w:p>
+        </w:tc>
+        <w:tc>
+          <w:tcPr/>
+          <w:p>
+            <w:pPr>
+              <w:pStyle w:val="Compact"/>
+              <w:jc w:val="right"/>
+            </w:pPr>
+            <w:r>
+              <w:t xml:space="preserve">72.53 ± 0.00</w:t>
+            </w:r>
+          </w:p>
+        </w:tc>
+        <w:tc>
+          <w:tcPr/>
+          <w:p>
+            <w:pPr>
+              <w:pStyle w:val="Compact"/>
+              <w:jc w:val="right"/>
+            </w:pPr>
+            <w:r>
+              <w:t xml:space="preserve">87798</w:t>
+            </w:r>
+          </w:p>
+        </w:tc>
+        <w:tc>
+          <w:tcPr/>
+          <w:p>
+            <w:pPr>
+              <w:pStyle w:val="Compact"/>
+            </w:pPr>
+            <w:r>
+              <w:t xml:space="preserve">Fresh Colab rerun reconciled from the user-provided terminal log on April 7, 2026. Drive-backed checkpoint files are now synced locally; the remote</w:t>
+            </w:r>
+            <w:r>
+              <w:t xml:space="preserve"> </w:t>
+            </w:r>
+            <w:r>
+              <w:rPr>
+                <w:rStyle w:val="VerbatimChar"/>
+              </w:rPr>
+              <w:t xml:space="preserve">experiments/v7_*</w:t>
+            </w:r>
+            <w:r>
+              <w:t xml:space="preserve"> </w:t>
+            </w:r>
+            <w:r>
+              <w:t xml:space="preserve">directory is still missing.</w:t>
             </w:r>
           </w:p>
         </w:tc>

</xml_diff>